<commit_message>
OP3 is the third one-pager, not the fifth
Co-Authored-By: Claude Opus 5 (1M context) <noreply@anthropic.com>
</commit_message>
<xml_diff>
--- a/week-03-voice-print/OP3 Voice Print.docx
+++ b/week-03-voice-print/OP3 Voice Print.docx
@@ -14,7 +14,7 @@
           <w:sz w:val="22"/>
           <w:szCs w:val="22"/>
         </w:rPr>
-        <w:t>One-Pager 5 — Voice Print</w:t>
+        <w:t>One-Pager 3 — Voice Print</w:t>
       </w:r>
       <w:r>
         <w:br w:type="textWrapping"/>
@@ -82,7 +82,7 @@
           <w:sz w:val="22"/>
           <w:szCs w:val="22"/>
         </w:rPr>
-        <w:t xml:space="preserve">In this assignment, your last one pager, your job is to bring back a voice you don’t hear anymore — a friend who moved, a relative who passed, a parent you no longer live with — and let their words make them present. </w:t>
+        <w:t xml:space="preserve">In this assignment, your third one pager, your job is to bring back a voice you don’t hear anymore — a friend who moved, a relative who passed, a parent you no longer live with — and let their words make them present. </w:t>
       </w:r>
     </w:p>
     <w:p>

</xml_diff>